<commit_message>
docs: remove internal sources from week 3 reports
</commit_message>
<xml_diff>
--- a/docs/week3/reports/多模态嵌入模块API文档.docx
+++ b/docs/week3/reports/多模态嵌入模块API文档.docx
@@ -121,7 +121,7 @@
           <w:color w:val="000000"/>
           <w:sz w:val="21"/>
         </w:rPr>
-        <w:t>2026-07-26</w:t>
+        <w:t>2026-07-27</w:t>
       </w:r>
     </w:p>
     <w:p>
@@ -3008,116 +3008,6 @@
         <w:t>模型清单中的相对路径必须位于配置的模型根目录内。</w:t>
       </w:r>
     </w:p>
-    <w:p>
-      <w:pPr>
-        <w:pStyle w:val="Heading2"/>
-      </w:pPr>
-      <w:r>
-        <w:rPr>
-          <w:rFonts w:ascii="Times New Roman" w:hAnsi="Times New Roman" w:eastAsia="Times New Roman"/>
-          <w:b/>
-          <w:i w:val="0"/>
-          <w:color w:val="000000"/>
-          <w:sz w:val="26"/>
-        </w:rPr>
-        <w:t>证据与来源</w:t>
-      </w:r>
-    </w:p>
-    <w:p>
-      <w:pPr>
-        <w:spacing w:after="80" w:line="300" w:lineRule="auto"/>
-        <w:numPr>
-          <w:ilvl w:val="0"/>
-          <w:numId w:val="12"/>
-        </w:numPr>
-      </w:pPr>
-      <w:r>
-        <w:rPr>
-          <w:rFonts w:ascii="Times New Roman" w:hAnsi="Times New Roman" w:eastAsia="Times New Roman"/>
-          <w:b w:val="0"/>
-          <w:i w:val="0"/>
-          <w:color w:val="000000"/>
-          <w:sz w:val="22"/>
-        </w:rPr>
-        <w:t>backend/src/content_retrieval/embeddings/</w:t>
-      </w:r>
-    </w:p>
-    <w:p>
-      <w:pPr>
-        <w:spacing w:after="80" w:line="300" w:lineRule="auto"/>
-        <w:numPr>
-          <w:ilvl w:val="0"/>
-          <w:numId w:val="12"/>
-        </w:numPr>
-      </w:pPr>
-      <w:r>
-        <w:rPr>
-          <w:rFonts w:ascii="Times New Roman" w:hAnsi="Times New Roman" w:eastAsia="Times New Roman"/>
-          <w:b w:val="0"/>
-          <w:i w:val="0"/>
-          <w:color w:val="000000"/>
-          <w:sz w:val="22"/>
-        </w:rPr>
-        <w:t>backend/src/content_retrieval/services/chunking.py</w:t>
-      </w:r>
-    </w:p>
-    <w:p>
-      <w:pPr>
-        <w:spacing w:after="80" w:line="300" w:lineRule="auto"/>
-        <w:numPr>
-          <w:ilvl w:val="0"/>
-          <w:numId w:val="12"/>
-        </w:numPr>
-      </w:pPr>
-      <w:r>
-        <w:rPr>
-          <w:rFonts w:ascii="Times New Roman" w:hAnsi="Times New Roman" w:eastAsia="Times New Roman"/>
-          <w:b w:val="0"/>
-          <w:i w:val="0"/>
-          <w:color w:val="000000"/>
-          <w:sz w:val="22"/>
-        </w:rPr>
-        <w:t>models/model-manifest.example.json</w:t>
-      </w:r>
-    </w:p>
-    <w:p>
-      <w:pPr>
-        <w:spacing w:after="80" w:line="300" w:lineRule="auto"/>
-        <w:numPr>
-          <w:ilvl w:val="0"/>
-          <w:numId w:val="12"/>
-        </w:numPr>
-      </w:pPr>
-      <w:r>
-        <w:rPr>
-          <w:rFonts w:ascii="Times New Roman" w:hAnsi="Times New Roman" w:eastAsia="Times New Roman"/>
-          <w:b w:val="0"/>
-          <w:i w:val="0"/>
-          <w:color w:val="000000"/>
-          <w:sz w:val="22"/>
-        </w:rPr>
-        <w:t>docs/week3/evidence/litert-text-parity.json</w:t>
-      </w:r>
-    </w:p>
-    <w:p>
-      <w:pPr>
-        <w:spacing w:after="80" w:line="300" w:lineRule="auto"/>
-        <w:numPr>
-          <w:ilvl w:val="0"/>
-          <w:numId w:val="12"/>
-        </w:numPr>
-      </w:pPr>
-      <w:r>
-        <w:rPr>
-          <w:rFonts w:ascii="Times New Roman" w:hAnsi="Times New Roman" w:eastAsia="Times New Roman"/>
-          <w:b w:val="0"/>
-          <w:i w:val="0"/>
-          <w:color w:val="000000"/>
-          <w:sz w:val="22"/>
-        </w:rPr>
-        <w:t>docs/week3/evidence/litert-mobileclip-parity.json</w:t>
-      </w:r>
-    </w:p>
     <w:sectPr>
       <w:headerReference w:type="default" r:id="rId9"/>
       <w:footerReference w:type="default" r:id="rId10"/>
@@ -3367,6 +3257,44 @@
       </w:rPr>
     </w:lvl>
   </w:abstractNum>
+  <w:abstractNum w:abstractNumId="9">
+    <w:multiLevelType w:val="singleLevel"/>
+    <w:lvl w:ilvl="0">
+      <w:start w:val="1"/>
+      <w:numFmt w:val="bullet"/>
+      <w:lvlText w:val="•"/>
+      <w:lvlJc w:val="left"/>
+      <w:pPr>
+        <w:tabs>
+          <w:tab w:val="num" w:pos="540"/>
+        </w:tabs>
+        <w:ind w:left="540" w:hanging="270"/>
+      </w:pPr>
+      <w:rPr>
+        <w:rFonts w:ascii="Times New Roman" w:hAnsi="Times New Roman" w:eastAsia="Times New Roman"/>
+        <w:color w:val="000000"/>
+      </w:rPr>
+    </w:lvl>
+  </w:abstractNum>
+  <w:abstractNum w:abstractNumId="10">
+    <w:multiLevelType w:val="singleLevel"/>
+    <w:lvl w:ilvl="0">
+      <w:start w:val="1"/>
+      <w:numFmt w:val="bullet"/>
+      <w:lvlText w:val="•"/>
+      <w:lvlJc w:val="left"/>
+      <w:pPr>
+        <w:tabs>
+          <w:tab w:val="num" w:pos="540"/>
+        </w:tabs>
+        <w:ind w:left="540" w:hanging="270"/>
+      </w:pPr>
+      <w:rPr>
+        <w:rFonts w:ascii="Times New Roman" w:hAnsi="Times New Roman" w:eastAsia="Times New Roman"/>
+        <w:color w:val="000000"/>
+      </w:rPr>
+    </w:lvl>
+  </w:abstractNum>
   <w:num w:numId="1">
     <w:abstractNumId w:val="8"/>
   </w:num>
@@ -3394,67 +3322,11 @@
   <w:num w:numId="9">
     <w:abstractNumId w:val="0"/>
   </w:num>
-  <w:abstractNum w:abstractNumId="9">
-    <w:multiLevelType w:val="singleLevel"/>
-    <w:lvl w:ilvl="0">
-      <w:start w:val="1"/>
-      <w:numFmt w:val="decimal"/>
-      <w:lvlText w:val="%1."/>
-      <w:lvlJc w:val="left"/>
-      <w:pPr>
-        <w:tabs>
-          <w:tab w:val="num" w:pos="540"/>
-        </w:tabs>
-        <w:ind w:left="540" w:hanging="270"/>
-      </w:pPr>
-    </w:lvl>
-  </w:abstractNum>
   <w:num w:numId="10">
     <w:abstractNumId w:val="9"/>
   </w:num>
-  <w:abstractNum w:abstractNumId="10">
-    <w:multiLevelType w:val="singleLevel"/>
-    <w:lvl w:ilvl="0">
-      <w:start w:val="1"/>
-      <w:numFmt w:val="bullet"/>
-      <w:lvlText w:val="•"/>
-      <w:lvlJc w:val="left"/>
-      <w:pPr>
-        <w:tabs>
-          <w:tab w:val="num" w:pos="540"/>
-        </w:tabs>
-        <w:ind w:left="540" w:hanging="270"/>
-      </w:pPr>
-      <w:rPr>
-        <w:rFonts w:ascii="Times New Roman" w:hAnsi="Times New Roman" w:eastAsia="Times New Roman"/>
-        <w:color w:val="000000"/>
-      </w:rPr>
-    </w:lvl>
-  </w:abstractNum>
   <w:num w:numId="11">
     <w:abstractNumId w:val="10"/>
-  </w:num>
-  <w:abstractNum w:abstractNumId="11">
-    <w:multiLevelType w:val="singleLevel"/>
-    <w:lvl w:ilvl="0">
-      <w:start w:val="1"/>
-      <w:numFmt w:val="bullet"/>
-      <w:lvlText w:val="•"/>
-      <w:lvlJc w:val="left"/>
-      <w:pPr>
-        <w:tabs>
-          <w:tab w:val="num" w:pos="540"/>
-        </w:tabs>
-        <w:ind w:left="540" w:hanging="270"/>
-      </w:pPr>
-      <w:rPr>
-        <w:rFonts w:ascii="Times New Roman" w:hAnsi="Times New Roman" w:eastAsia="Times New Roman"/>
-        <w:color w:val="000000"/>
-      </w:rPr>
-    </w:lvl>
-  </w:abstractNum>
-  <w:num w:numId="12">
-    <w:abstractNumId w:val="11"/>
   </w:num>
 </w:numbering>
 </file>

</xml_diff>